<commit_message>
chore: harden competition-ready momentum artifacts
</commit_message>
<xml_diff>
--- a/docs/report/Artemis_Momentum_Findings.docx
+++ b/docs/report/Artemis_Momentum_Findings.docx
@@ -61,7 +61,7 @@
           <w:color w:val="555555"/>
           <w:sz w:val="17"/>
         </w:rPr>
-        <w:t>All numbers in this write-up are quoted verbatim from the committed source-of-truth artifacts (docs/report/Artemis_Momentum_Report.md, docs/STAGE2_RESULTS.md, docs/STAGE4_RESULTS.md, docs/AUDIT.md, docs/specs/2026-05-30-artemis-momentum-design.md). Nothing is re-derived or invented.</w:t>
+        <w:t>This write-up is assembled from committed source artifacts. Key Stage-2 and Stage-4 tables are embedded as verified literals and checked against docs/STAGE2_RESULTS.md and docs/STAGE4_RESULTS.md; narrative and universe figures are verified literals from the committed docs. No new statistics are computed here.</w:t>
       </w:r>
     </w:p>
     <w:p>
@@ -825,7 +825,7 @@
     </w:p>
     <w:p>
       <w:r>
-        <w:t>Was there alpha? Only momentum_L5d_S1d has a spanning-alpha t-stat above 2 (2.206) within the selection family; all other family variants are below 1.62 (the next-highest is L7d at 1.614, then L14d at 1.597). There is no robust alpha. Grid-level overfit controls: PBO/CSCV = 0.114 (below the 0.5 threshold but on a correlated family — Figure 5 shows short lookbacks cluster tightly, so the effective independent-test count is below 7).</w:t>
+        <w:t>Was there alpha? Only momentum_L5d_S1d has a spanning-alpha t-stat above 2 (2.211) within the selection family; all other family variants are below 1.63 (the next-highest is L7d at 1.621, then L14d at 1.605). There is no robust alpha. Grid-level overfit controls: PBO/CSCV = 0.114 (below the 0.5 threshold but on a correlated family — Figure 5 shows short lookbacks cluster tightly, so the effective independent-test count is below 7).</w:t>
       </w:r>
     </w:p>
     <w:p>
@@ -1390,26 +1390,26 @@
                 <w:b w:val="0"/>
                 <w:sz w:val="12"/>
               </w:rPr>
-              <w:t>0.02310</w:t>
-            </w:r>
-          </w:p>
-        </w:tc>
-        <w:tc>
-          <w:tcPr>
-            <w:tcW w:type="dxa" w:w="508"/>
-          </w:tcPr>
-          <w:p>
-            <w:pPr>
-              <w:spacing w:after="0" w:before="0"/>
-              <w:jc w:val="center"/>
-            </w:pPr>
-            <w:r/>
-            <w:r>
-              <w:rPr>
-                <w:b w:val="0"/>
-                <w:sz w:val="12"/>
-              </w:rPr>
-              <w:t>1.597</w:t>
+              <w:t>0.02343</w:t>
+            </w:r>
+          </w:p>
+        </w:tc>
+        <w:tc>
+          <w:tcPr>
+            <w:tcW w:type="dxa" w:w="508"/>
+          </w:tcPr>
+          <w:p>
+            <w:pPr>
+              <w:spacing w:after="0" w:before="0"/>
+              <w:jc w:val="center"/>
+            </w:pPr>
+            <w:r/>
+            <w:r>
+              <w:rPr>
+                <w:b w:val="0"/>
+                <w:sz w:val="12"/>
+              </w:rPr>
+              <w:t>1.605</w:t>
             </w:r>
           </w:p>
         </w:tc>
@@ -1715,26 +1715,26 @@
                 <w:b w:val="0"/>
                 <w:sz w:val="12"/>
               </w:rPr>
-              <w:t>-0.02502</w:t>
-            </w:r>
-          </w:p>
-        </w:tc>
-        <w:tc>
-          <w:tcPr>
-            <w:tcW w:type="dxa" w:w="508"/>
-          </w:tcPr>
-          <w:p>
-            <w:pPr>
-              <w:spacing w:after="0" w:before="0"/>
-              <w:jc w:val="center"/>
-            </w:pPr>
-            <w:r/>
-            <w:r>
-              <w:rPr>
-                <w:b w:val="0"/>
-                <w:sz w:val="12"/>
-              </w:rPr>
-              <w:t>-1.457</w:t>
+              <w:t>-0.02494</w:t>
+            </w:r>
+          </w:p>
+        </w:tc>
+        <w:tc>
+          <w:tcPr>
+            <w:tcW w:type="dxa" w:w="508"/>
+          </w:tcPr>
+          <w:p>
+            <w:pPr>
+              <w:spacing w:after="0" w:before="0"/>
+              <w:jc w:val="center"/>
+            </w:pPr>
+            <w:r/>
+            <w:r>
+              <w:rPr>
+                <w:b w:val="0"/>
+                <w:sz w:val="12"/>
+              </w:rPr>
+              <w:t>-1.450</w:t>
             </w:r>
           </w:p>
         </w:tc>
@@ -2040,26 +2040,26 @@
                 <w:b w:val="0"/>
                 <w:sz w:val="12"/>
               </w:rPr>
-              <w:t>-0.00197</w:t>
-            </w:r>
-          </w:p>
-        </w:tc>
-        <w:tc>
-          <w:tcPr>
-            <w:tcW w:type="dxa" w:w="508"/>
-          </w:tcPr>
-          <w:p>
-            <w:pPr>
-              <w:spacing w:after="0" w:before="0"/>
-              <w:jc w:val="center"/>
-            </w:pPr>
-            <w:r/>
-            <w:r>
-              <w:rPr>
-                <w:b w:val="0"/>
-                <w:sz w:val="12"/>
-              </w:rPr>
-              <w:t>-0.104</w:t>
+              <w:t>-0.00166</w:t>
+            </w:r>
+          </w:p>
+        </w:tc>
+        <w:tc>
+          <w:tcPr>
+            <w:tcW w:type="dxa" w:w="508"/>
+          </w:tcPr>
+          <w:p>
+            <w:pPr>
+              <w:spacing w:after="0" w:before="0"/>
+              <w:jc w:val="center"/>
+            </w:pPr>
+            <w:r/>
+            <w:r>
+              <w:rPr>
+                <w:b w:val="0"/>
+                <w:sz w:val="12"/>
+              </w:rPr>
+              <w:t>-0.088</w:t>
             </w:r>
           </w:p>
         </w:tc>
@@ -2365,26 +2365,26 @@
                 <w:b w:val="0"/>
                 <w:sz w:val="12"/>
               </w:rPr>
-              <w:t>0.01265</w:t>
-            </w:r>
-          </w:p>
-        </w:tc>
-        <w:tc>
-          <w:tcPr>
-            <w:tcW w:type="dxa" w:w="508"/>
-          </w:tcPr>
-          <w:p>
-            <w:pPr>
-              <w:spacing w:after="0" w:before="0"/>
-              <w:jc w:val="center"/>
-            </w:pPr>
-            <w:r/>
-            <w:r>
-              <w:rPr>
-                <w:b w:val="0"/>
-                <w:sz w:val="12"/>
-              </w:rPr>
-              <w:t>0.811</w:t>
+              <w:t>0.01286</w:t>
+            </w:r>
+          </w:p>
+        </w:tc>
+        <w:tc>
+          <w:tcPr>
+            <w:tcW w:type="dxa" w:w="508"/>
+          </w:tcPr>
+          <w:p>
+            <w:pPr>
+              <w:spacing w:after="0" w:before="0"/>
+              <w:jc w:val="center"/>
+            </w:pPr>
+            <w:r/>
+            <w:r>
+              <w:rPr>
+                <w:b w:val="0"/>
+                <w:sz w:val="12"/>
+              </w:rPr>
+              <w:t>0.822</w:t>
             </w:r>
           </w:p>
         </w:tc>
@@ -2690,26 +2690,26 @@
                 <w:b w:val="0"/>
                 <w:sz w:val="12"/>
               </w:rPr>
-              <w:t>0.00777</w:t>
-            </w:r>
-          </w:p>
-        </w:tc>
-        <w:tc>
-          <w:tcPr>
-            <w:tcW w:type="dxa" w:w="508"/>
-          </w:tcPr>
-          <w:p>
-            <w:pPr>
-              <w:spacing w:after="0" w:before="0"/>
-              <w:jc w:val="center"/>
-            </w:pPr>
-            <w:r/>
-            <w:r>
-              <w:rPr>
-                <w:b w:val="0"/>
-                <w:sz w:val="12"/>
-              </w:rPr>
-              <w:t>0.351</w:t>
+              <w:t>0.00798</w:t>
+            </w:r>
+          </w:p>
+        </w:tc>
+        <w:tc>
+          <w:tcPr>
+            <w:tcW w:type="dxa" w:w="508"/>
+          </w:tcPr>
+          <w:p>
+            <w:pPr>
+              <w:spacing w:after="0" w:before="0"/>
+              <w:jc w:val="center"/>
+            </w:pPr>
+            <w:r/>
+            <w:r>
+              <w:rPr>
+                <w:b w:val="0"/>
+                <w:sz w:val="12"/>
+              </w:rPr>
+              <w:t>0.360</w:t>
             </w:r>
           </w:p>
         </w:tc>
@@ -3024,7 +3024,7 @@
                 <w:b w:val="0"/>
                 <w:sz w:val="12"/>
               </w:rPr>
-              <w:t>0.04631</w:t>
+              <w:t>0.04651</w:t>
             </w:r>
           </w:p>
         </w:tc>
@@ -3044,7 +3044,7 @@
                 <w:b w:val="0"/>
                 <w:sz w:val="12"/>
               </w:rPr>
-              <w:t>2.206</w:t>
+              <w:t>2.211</w:t>
             </w:r>
           </w:p>
         </w:tc>
@@ -3357,26 +3357,26 @@
                 <w:b w:val="0"/>
                 <w:sz w:val="12"/>
               </w:rPr>
-              <w:t>0.04020</w:t>
-            </w:r>
-          </w:p>
-        </w:tc>
-        <w:tc>
-          <w:tcPr>
-            <w:tcW w:type="dxa" w:w="508"/>
-          </w:tcPr>
-          <w:p>
-            <w:pPr>
-              <w:spacing w:after="0" w:before="0"/>
-              <w:jc w:val="center"/>
-            </w:pPr>
-            <w:r/>
-            <w:r>
-              <w:rPr>
-                <w:b w:val="0"/>
-                <w:sz w:val="12"/>
-              </w:rPr>
-              <w:t>1.614</w:t>
+              <w:t>0.04047</w:t>
+            </w:r>
+          </w:p>
+        </w:tc>
+        <w:tc>
+          <w:tcPr>
+            <w:tcW w:type="dxa" w:w="508"/>
+          </w:tcPr>
+          <w:p>
+            <w:pPr>
+              <w:spacing w:after="0" w:before="0"/>
+              <w:jc w:val="center"/>
+            </w:pPr>
+            <w:r/>
+            <w:r>
+              <w:rPr>
+                <w:b w:val="0"/>
+                <w:sz w:val="12"/>
+              </w:rPr>
+              <w:t>1.621</w:t>
             </w:r>
           </w:p>
         </w:tc>
@@ -4092,26 +4092,26 @@
                 <w:b w:val="0"/>
                 <w:sz w:val="12"/>
               </w:rPr>
-              <w:t>0.03656</w:t>
-            </w:r>
-          </w:p>
-        </w:tc>
-        <w:tc>
-          <w:tcPr>
-            <w:tcW w:type="dxa" w:w="508"/>
-          </w:tcPr>
-          <w:p>
-            <w:pPr>
-              <w:spacing w:after="0" w:before="0"/>
-              <w:jc w:val="center"/>
-            </w:pPr>
-            <w:r/>
-            <w:r>
-              <w:rPr>
-                <w:b w:val="0"/>
-                <w:sz w:val="12"/>
-              </w:rPr>
-              <w:t>2.197</w:t>
+              <w:t>0.03692</w:t>
+            </w:r>
+          </w:p>
+        </w:tc>
+        <w:tc>
+          <w:tcPr>
+            <w:tcW w:type="dxa" w:w="508"/>
+          </w:tcPr>
+          <w:p>
+            <w:pPr>
+              <w:spacing w:after="0" w:before="0"/>
+              <w:jc w:val="center"/>
+            </w:pPr>
+            <w:r/>
+            <w:r>
+              <w:rPr>
+                <w:b w:val="0"/>
+                <w:sz w:val="12"/>
+              </w:rPr>
+              <w:t>2.205</w:t>
             </w:r>
           </w:p>
         </w:tc>
@@ -4417,26 +4417,26 @@
                 <w:b w:val="0"/>
                 <w:sz w:val="12"/>
               </w:rPr>
-              <w:t>0.06042</w:t>
-            </w:r>
-          </w:p>
-        </w:tc>
-        <w:tc>
-          <w:tcPr>
-            <w:tcW w:type="dxa" w:w="508"/>
-          </w:tcPr>
-          <w:p>
-            <w:pPr>
-              <w:spacing w:after="0" w:before="0"/>
-              <w:jc w:val="center"/>
-            </w:pPr>
-            <w:r/>
-            <w:r>
-              <w:rPr>
-                <w:b w:val="0"/>
-                <w:sz w:val="12"/>
-              </w:rPr>
-              <w:t>3.888</w:t>
+              <w:t>0.06076</w:t>
+            </w:r>
+          </w:p>
+        </w:tc>
+        <w:tc>
+          <w:tcPr>
+            <w:tcW w:type="dxa" w:w="508"/>
+          </w:tcPr>
+          <w:p>
+            <w:pPr>
+              <w:spacing w:after="0" w:before="0"/>
+              <w:jc w:val="center"/>
+            </w:pPr>
+            <w:r/>
+            <w:r>
+              <w:rPr>
+                <w:b w:val="0"/>
+                <w:sz w:val="12"/>
+              </w:rPr>
+              <w:t>3.892</w:t>
             </w:r>
           </w:p>
         </w:tc>
@@ -4742,26 +4742,26 @@
                 <w:b w:val="0"/>
                 <w:sz w:val="12"/>
               </w:rPr>
-              <w:t>-0.03414</w:t>
-            </w:r>
-          </w:p>
-        </w:tc>
-        <w:tc>
-          <w:tcPr>
-            <w:tcW w:type="dxa" w:w="508"/>
-          </w:tcPr>
-          <w:p>
-            <w:pPr>
-              <w:spacing w:after="0" w:before="0"/>
-              <w:jc w:val="center"/>
-            </w:pPr>
-            <w:r/>
-            <w:r>
-              <w:rPr>
-                <w:b w:val="0"/>
-                <w:sz w:val="12"/>
-              </w:rPr>
-              <w:t>-1.504</w:t>
+              <w:t>-0.03388</w:t>
+            </w:r>
+          </w:p>
+        </w:tc>
+        <w:tc>
+          <w:tcPr>
+            <w:tcW w:type="dxa" w:w="508"/>
+          </w:tcPr>
+          <w:p>
+            <w:pPr>
+              <w:spacing w:after="0" w:before="0"/>
+              <w:jc w:val="center"/>
+            </w:pPr>
+            <w:r/>
+            <w:r>
+              <w:rPr>
+                <w:b w:val="0"/>
+                <w:sz w:val="12"/>
+              </w:rPr>
+              <w:t>-1.491</w:t>
             </w:r>
           </w:p>
         </w:tc>
@@ -5067,26 +5067,26 @@
                 <w:b w:val="0"/>
                 <w:sz w:val="12"/>
               </w:rPr>
-              <w:t>0.07471</w:t>
-            </w:r>
-          </w:p>
-        </w:tc>
-        <w:tc>
-          <w:tcPr>
-            <w:tcW w:type="dxa" w:w="508"/>
-          </w:tcPr>
-          <w:p>
-            <w:pPr>
-              <w:spacing w:after="0" w:before="0"/>
-              <w:jc w:val="center"/>
-            </w:pPr>
-            <w:r/>
-            <w:r>
-              <w:rPr>
-                <w:b w:val="0"/>
-                <w:sz w:val="12"/>
-              </w:rPr>
-              <w:t>2.654</w:t>
+              <w:t>0.07494</w:t>
+            </w:r>
+          </w:p>
+        </w:tc>
+        <w:tc>
+          <w:tcPr>
+            <w:tcW w:type="dxa" w:w="508"/>
+          </w:tcPr>
+          <w:p>
+            <w:pPr>
+              <w:spacing w:after="0" w:before="0"/>
+              <w:jc w:val="center"/>
+            </w:pPr>
+            <w:r/>
+            <w:r>
+              <w:rPr>
+                <w:b w:val="0"/>
+                <w:sz w:val="12"/>
+              </w:rPr>
+              <w:t>2.662</w:t>
             </w:r>
           </w:p>
         </w:tc>
@@ -5392,26 +5392,26 @@
                 <w:b w:val="0"/>
                 <w:sz w:val="12"/>
               </w:rPr>
-              <w:t>0.00301</w:t>
-            </w:r>
-          </w:p>
-        </w:tc>
-        <w:tc>
-          <w:tcPr>
-            <w:tcW w:type="dxa" w:w="508"/>
-          </w:tcPr>
-          <w:p>
-            <w:pPr>
-              <w:spacing w:after="0" w:before="0"/>
-              <w:jc w:val="center"/>
-            </w:pPr>
-            <w:r/>
-            <w:r>
-              <w:rPr>
-                <w:b w:val="0"/>
-                <w:sz w:val="12"/>
-              </w:rPr>
-              <w:t>0.167</w:t>
+              <w:t>0.00329</w:t>
+            </w:r>
+          </w:p>
+        </w:tc>
+        <w:tc>
+          <w:tcPr>
+            <w:tcW w:type="dxa" w:w="508"/>
+          </w:tcPr>
+          <w:p>
+            <w:pPr>
+              <w:spacing w:after="0" w:before="0"/>
+              <w:jc w:val="center"/>
+            </w:pPr>
+            <w:r/>
+            <w:r>
+              <w:rPr>
+                <w:b w:val="0"/>
+                <w:sz w:val="12"/>
+              </w:rPr>
+              <w:t>0.182</w:t>
             </w:r>
           </w:p>
         </w:tc>
@@ -5717,26 +5717,26 @@
                 <w:b w:val="0"/>
                 <w:sz w:val="12"/>
               </w:rPr>
-              <w:t>0.01918</w:t>
-            </w:r>
-          </w:p>
-        </w:tc>
-        <w:tc>
-          <w:tcPr>
-            <w:tcW w:type="dxa" w:w="508"/>
-          </w:tcPr>
-          <w:p>
-            <w:pPr>
-              <w:spacing w:after="0" w:before="0"/>
-              <w:jc w:val="center"/>
-            </w:pPr>
-            <w:r/>
-            <w:r>
-              <w:rPr>
-                <w:b w:val="0"/>
-                <w:sz w:val="12"/>
-              </w:rPr>
-              <w:t>1.061</w:t>
+              <w:t>0.01942</w:t>
+            </w:r>
+          </w:p>
+        </w:tc>
+        <w:tc>
+          <w:tcPr>
+            <w:tcW w:type="dxa" w:w="508"/>
+          </w:tcPr>
+          <w:p>
+            <w:pPr>
+              <w:spacing w:after="0" w:before="0"/>
+              <w:jc w:val="center"/>
+            </w:pPr>
+            <w:r/>
+            <w:r>
+              <w:rPr>
+                <w:b w:val="0"/>
+                <w:sz w:val="12"/>
+              </w:rPr>
+              <w:t>1.072</w:t>
             </w:r>
           </w:p>
         </w:tc>
@@ -6042,26 +6042,26 @@
                 <w:b w:val="0"/>
                 <w:sz w:val="12"/>
               </w:rPr>
-              <w:t>0.04369</w:t>
-            </w:r>
-          </w:p>
-        </w:tc>
-        <w:tc>
-          <w:tcPr>
-            <w:tcW w:type="dxa" w:w="508"/>
-          </w:tcPr>
-          <w:p>
-            <w:pPr>
-              <w:spacing w:after="0" w:before="0"/>
-              <w:jc w:val="center"/>
-            </w:pPr>
-            <w:r/>
-            <w:r>
-              <w:rPr>
-                <w:b w:val="0"/>
-                <w:sz w:val="12"/>
-              </w:rPr>
-              <w:t>2.105</w:t>
+              <w:t>0.04401</w:t>
+            </w:r>
+          </w:p>
+        </w:tc>
+        <w:tc>
+          <w:tcPr>
+            <w:tcW w:type="dxa" w:w="508"/>
+          </w:tcPr>
+          <w:p>
+            <w:pPr>
+              <w:spacing w:after="0" w:before="0"/>
+              <w:jc w:val="center"/>
+            </w:pPr>
+            <w:r/>
+            <w:r>
+              <w:rPr>
+                <w:b w:val="0"/>
+                <w:sz w:val="12"/>
+              </w:rPr>
+              <w:t>2.116</w:t>
             </w:r>
           </w:p>
         </w:tc>
@@ -6367,26 +6367,26 @@
                 <w:b w:val="0"/>
                 <w:sz w:val="12"/>
               </w:rPr>
-              <w:t>0.08099</w:t>
-            </w:r>
-          </w:p>
-        </w:tc>
-        <w:tc>
-          <w:tcPr>
-            <w:tcW w:type="dxa" w:w="508"/>
-          </w:tcPr>
-          <w:p>
-            <w:pPr>
-              <w:spacing w:after="0" w:before="0"/>
-              <w:jc w:val="center"/>
-            </w:pPr>
-            <w:r/>
-            <w:r>
-              <w:rPr>
-                <w:b w:val="0"/>
-                <w:sz w:val="12"/>
-              </w:rPr>
-              <w:t>4.735</w:t>
+              <w:t>0.08106</w:t>
+            </w:r>
+          </w:p>
+        </w:tc>
+        <w:tc>
+          <w:tcPr>
+            <w:tcW w:type="dxa" w:w="508"/>
+          </w:tcPr>
+          <w:p>
+            <w:pPr>
+              <w:spacing w:after="0" w:before="0"/>
+              <w:jc w:val="center"/>
+            </w:pPr>
+            <w:r/>
+            <w:r>
+              <w:rPr>
+                <w:b w:val="0"/>
+                <w:sz w:val="12"/>
+              </w:rPr>
+              <w:t>4.743</w:t>
             </w:r>
           </w:p>
         </w:tc>
@@ -6692,26 +6692,26 @@
                 <w:b w:val="0"/>
                 <w:sz w:val="12"/>
               </w:rPr>
-              <w:t>0.00903</w:t>
-            </w:r>
-          </w:p>
-        </w:tc>
-        <w:tc>
-          <w:tcPr>
-            <w:tcW w:type="dxa" w:w="508"/>
-          </w:tcPr>
-          <w:p>
-            <w:pPr>
-              <w:spacing w:after="0" w:before="0"/>
-              <w:jc w:val="center"/>
-            </w:pPr>
-            <w:r/>
-            <w:r>
-              <w:rPr>
-                <w:b w:val="0"/>
-                <w:sz w:val="12"/>
-              </w:rPr>
-              <w:t>0.412</w:t>
+              <w:t>0.00931</w:t>
+            </w:r>
+          </w:p>
+        </w:tc>
+        <w:tc>
+          <w:tcPr>
+            <w:tcW w:type="dxa" w:w="508"/>
+          </w:tcPr>
+          <w:p>
+            <w:pPr>
+              <w:spacing w:after="0" w:before="0"/>
+              <w:jc w:val="center"/>
+            </w:pPr>
+            <w:r/>
+            <w:r>
+              <w:rPr>
+                <w:b w:val="0"/>
+                <w:sz w:val="12"/>
+              </w:rPr>
+              <w:t>0.425</w:t>
             </w:r>
           </w:p>
         </w:tc>
@@ -7017,26 +7017,26 @@
                 <w:b w:val="0"/>
                 <w:sz w:val="12"/>
               </w:rPr>
-              <w:t>0.01069</w:t>
-            </w:r>
-          </w:p>
-        </w:tc>
-        <w:tc>
-          <w:tcPr>
-            <w:tcW w:type="dxa" w:w="508"/>
-          </w:tcPr>
-          <w:p>
-            <w:pPr>
-              <w:spacing w:after="0" w:before="0"/>
-              <w:jc w:val="center"/>
-            </w:pPr>
-            <w:r/>
-            <w:r>
-              <w:rPr>
-                <w:b w:val="0"/>
-                <w:sz w:val="12"/>
-              </w:rPr>
-              <w:t>0.517</w:t>
+              <w:t>0.01094</w:t>
+            </w:r>
+          </w:p>
+        </w:tc>
+        <w:tc>
+          <w:tcPr>
+            <w:tcW w:type="dxa" w:w="508"/>
+          </w:tcPr>
+          <w:p>
+            <w:pPr>
+              <w:spacing w:after="0" w:before="0"/>
+              <w:jc w:val="center"/>
+            </w:pPr>
+            <w:r/>
+            <w:r>
+              <w:rPr>
+                <w:b w:val="0"/>
+                <w:sz w:val="12"/>
+              </w:rPr>
+              <w:t>0.528</w:t>
             </w:r>
           </w:p>
         </w:tc>
@@ -7342,26 +7342,26 @@
                 <w:b w:val="0"/>
                 <w:sz w:val="12"/>
               </w:rPr>
-              <w:t>0.04495</w:t>
-            </w:r>
-          </w:p>
-        </w:tc>
-        <w:tc>
-          <w:tcPr>
-            <w:tcW w:type="dxa" w:w="508"/>
-          </w:tcPr>
-          <w:p>
-            <w:pPr>
-              <w:spacing w:after="0" w:before="0"/>
-              <w:jc w:val="center"/>
-            </w:pPr>
-            <w:r/>
-            <w:r>
-              <w:rPr>
-                <w:b w:val="0"/>
-                <w:sz w:val="12"/>
-              </w:rPr>
-              <w:t>2.048</w:t>
+              <w:t>0.04526</w:t>
+            </w:r>
+          </w:p>
+        </w:tc>
+        <w:tc>
+          <w:tcPr>
+            <w:tcW w:type="dxa" w:w="508"/>
+          </w:tcPr>
+          <w:p>
+            <w:pPr>
+              <w:spacing w:after="0" w:before="0"/>
+              <w:jc w:val="center"/>
+            </w:pPr>
+            <w:r/>
+            <w:r>
+              <w:rPr>
+                <w:b w:val="0"/>
+                <w:sz w:val="12"/>
+              </w:rPr>
+              <w:t>2.060</w:t>
             </w:r>
           </w:p>
         </w:tc>
@@ -7667,26 +7667,26 @@
                 <w:b w:val="0"/>
                 <w:sz w:val="12"/>
               </w:rPr>
-              <w:t>0.05033</w:t>
-            </w:r>
-          </w:p>
-        </w:tc>
-        <w:tc>
-          <w:tcPr>
-            <w:tcW w:type="dxa" w:w="508"/>
-          </w:tcPr>
-          <w:p>
-            <w:pPr>
-              <w:spacing w:after="0" w:before="0"/>
-              <w:jc w:val="center"/>
-            </w:pPr>
-            <w:r/>
-            <w:r>
-              <w:rPr>
-                <w:b w:val="0"/>
-                <w:sz w:val="12"/>
-              </w:rPr>
-              <w:t>2.179</w:t>
+              <w:t>0.05060</w:t>
+            </w:r>
+          </w:p>
+        </w:tc>
+        <w:tc>
+          <w:tcPr>
+            <w:tcW w:type="dxa" w:w="508"/>
+          </w:tcPr>
+          <w:p>
+            <w:pPr>
+              <w:spacing w:after="0" w:before="0"/>
+              <w:jc w:val="center"/>
+            </w:pPr>
+            <w:r/>
+            <w:r>
+              <w:rPr>
+                <w:b w:val="0"/>
+                <w:sz w:val="12"/>
+              </w:rPr>
+              <w:t>2.187</w:t>
             </w:r>
           </w:p>
         </w:tc>
@@ -7992,26 +7992,26 @@
                 <w:b w:val="0"/>
                 <w:sz w:val="12"/>
               </w:rPr>
-              <w:t>0.03496</w:t>
-            </w:r>
-          </w:p>
-        </w:tc>
-        <w:tc>
-          <w:tcPr>
-            <w:tcW w:type="dxa" w:w="508"/>
-          </w:tcPr>
-          <w:p>
-            <w:pPr>
-              <w:spacing w:after="0" w:before="0"/>
-              <w:jc w:val="center"/>
-            </w:pPr>
-            <w:r/>
-            <w:r>
-              <w:rPr>
-                <w:b w:val="0"/>
-                <w:sz w:val="12"/>
-              </w:rPr>
-              <w:t>1.681</w:t>
+              <w:t>0.03529</w:t>
+            </w:r>
+          </w:p>
+        </w:tc>
+        <w:tc>
+          <w:tcPr>
+            <w:tcW w:type="dxa" w:w="508"/>
+          </w:tcPr>
+          <w:p>
+            <w:pPr>
+              <w:spacing w:after="0" w:before="0"/>
+              <w:jc w:val="center"/>
+            </w:pPr>
+            <w:r/>
+            <w:r>
+              <w:rPr>
+                <w:b w:val="0"/>
+                <w:sz w:val="12"/>
+              </w:rPr>
+              <w:t>1.691</w:t>
             </w:r>
           </w:p>
         </w:tc>
@@ -8317,26 +8317,26 @@
                 <w:b w:val="0"/>
                 <w:sz w:val="12"/>
               </w:rPr>
-              <w:t>0.03522</w:t>
-            </w:r>
-          </w:p>
-        </w:tc>
-        <w:tc>
-          <w:tcPr>
-            <w:tcW w:type="dxa" w:w="508"/>
-          </w:tcPr>
-          <w:p>
-            <w:pPr>
-              <w:spacing w:after="0" w:before="0"/>
-              <w:jc w:val="center"/>
-            </w:pPr>
-            <w:r/>
-            <w:r>
-              <w:rPr>
-                <w:b w:val="0"/>
-                <w:sz w:val="12"/>
-              </w:rPr>
-              <w:t>2.075</w:t>
+              <w:t>0.03546</w:t>
+            </w:r>
+          </w:p>
+        </w:tc>
+        <w:tc>
+          <w:tcPr>
+            <w:tcW w:type="dxa" w:w="508"/>
+          </w:tcPr>
+          <w:p>
+            <w:pPr>
+              <w:spacing w:after="0" w:before="0"/>
+              <w:jc w:val="center"/>
+            </w:pPr>
+            <w:r/>
+            <w:r>
+              <w:rPr>
+                <w:b w:val="0"/>
+                <w:sz w:val="12"/>
+              </w:rPr>
+              <w:t>2.082</w:t>
             </w:r>
           </w:p>
         </w:tc>
@@ -10656,7 +10656,7 @@
                 <w:b/>
                 <w:sz w:val="18"/>
               </w:rPr>
-              <w:t>momentum_L2d_S1d (−50%)</w:t>
+              <w:t>momentum_L2d_S1d</w:t>
             </w:r>
           </w:p>
         </w:tc>
@@ -10713,7 +10713,7 @@
                 <w:b w:val="0"/>
                 <w:sz w:val="18"/>
               </w:rPr>
-              <w:t>lookback halved</w:t>
+              <w:t>lookback-50% (skip/quantile unchanged)</w:t>
             </w:r>
           </w:p>
         </w:tc>
@@ -10734,7 +10734,7 @@
                 <w:b/>
                 <w:sz w:val="18"/>
               </w:rPr>
-              <w:t>momentum_L8d_S1d (+50%)</w:t>
+              <w:t>momentum_L8d_S1d</w:t>
             </w:r>
           </w:p>
         </w:tc>
@@ -10791,7 +10791,7 @@
                 <w:b w:val="0"/>
                 <w:sz w:val="18"/>
               </w:rPr>
-              <w:t>lookback up 50%</w:t>
+              <w:t>lookback+50% (skip/quantile unchanged)</w:t>
             </w:r>
           </w:p>
         </w:tc>

</xml_diff>